<commit_message>
Move confidence/understood into in-task questions, remove whose_thinking and Reflections page; update export and data dictionary
</commit_message>
<xml_diff>
--- a/Research_Scholars_Survey_CSV_Data_Dictionary_Final_Viewport_Six_Regions_30s.docx
+++ b/Research_Scholars_Survey_CSV_Data_Dictionary_Final_Viewport_Six_Regions_30s.docx
@@ -5887,7 +5887,7 @@
         <w:spacing w:before="160" w:after="80"/>
       </w:pPr>
       <w:r>
-        <w:t>2.5 Task responses, ratings, reflections, and quiz</w:t>
+        <w:t>2.5 Task responses, ratings, and quiz</w:t>
       </w:r>
     </w:p>
     <w:p>
@@ -6288,7 +6288,7 @@
               <w:rPr>
                 <w:sz w:val="16"/>
               </w:rPr>
-              <w:t>confidence_&lt;paper&gt;</w:t>
+              <w:t>&lt;paper&gt;_confidence</w:t>
             </w:r>
           </w:p>
         </w:tc>
@@ -6359,7 +6359,7 @@
               <w:rPr>
                 <w:sz w:val="16"/>
               </w:rPr>
-              <w:t>understood_&lt;paper&gt;</w:t>
+              <w:t>&lt;paper&gt;_understood</w:t>
             </w:r>
           </w:p>
         </w:tc>
@@ -6383,77 +6383,6 @@
                 <w:sz w:val="16"/>
               </w:rPr>
               <w:t>Self-rated understanding of that paper.</w:t>
-            </w:r>
-          </w:p>
-        </w:tc>
-        <w:tc>
-          <w:tcPr>
-            <w:tcW w:type="dxa" w:w="1440"/>
-            <w:vAlign w:val="center"/>
-            <w:tcMar>
-              <w:top w:w="70" w:type="dxa"/>
-              <w:start w:w="70" w:type="dxa"/>
-              <w:bottom w:w="70" w:type="dxa"/>
-              <w:end w:w="70" w:type="dxa"/>
-            </w:tcMar>
-          </w:tcPr>
-          <w:p>
-            <w:pPr>
-              <w:spacing w:after="0"/>
-            </w:pPr>
-            <w:r>
-              <w:rPr>
-                <w:sz w:val="16"/>
-              </w:rPr>
-              <w:t>1–7</w:t>
-            </w:r>
-          </w:p>
-        </w:tc>
-      </w:tr>
-      <w:tr>
-        <w:tc>
-          <w:tcPr>
-            <w:tcW w:type="dxa" w:w="4608"/>
-            <w:vAlign w:val="center"/>
-            <w:tcMar>
-              <w:top w:w="70" w:type="dxa"/>
-              <w:start w:w="70" w:type="dxa"/>
-              <w:bottom w:w="70" w:type="dxa"/>
-              <w:end w:w="70" w:type="dxa"/>
-            </w:tcMar>
-          </w:tcPr>
-          <w:p>
-            <w:pPr>
-              <w:spacing w:after="0"/>
-            </w:pPr>
-            <w:r>
-              <w:rPr>
-                <w:sz w:val="16"/>
-              </w:rPr>
-              <w:t>whose_thinking</w:t>
-            </w:r>
-          </w:p>
-        </w:tc>
-        <w:tc>
-          <w:tcPr>
-            <w:tcW w:type="dxa" w:w="5040"/>
-            <w:vAlign w:val="center"/>
-            <w:tcMar>
-              <w:top w:w="70" w:type="dxa"/>
-              <w:start w:w="70" w:type="dxa"/>
-              <w:bottom w:w="70" w:type="dxa"/>
-              <w:end w:w="70" w:type="dxa"/>
-            </w:tcMar>
-          </w:tcPr>
-          <w:p>
-            <w:pPr>
-              <w:spacing w:after="0"/>
-            </w:pPr>
-            <w:r>
-              <w:rPr>
-                <w:sz w:val="16"/>
-              </w:rPr>
-              <w:t>Overall ownership rating, from mostly AI to mostly participant.</w:t>
             </w:r>
           </w:p>
         </w:tc>

</xml_diff>